<commit_message>
Left-align DOCX tables, fix Discussion claims, copyedits, dagger star notation
- Add filters/left-align-tables.lua (post-render, docx only) to left-align table text
- Revise Discussion so cost-concern results are not implied in main text; align
  cue x identity WTP claims with Results
- Copyedits in Introduction, lit review, and Data and Measures
- Use dagger/*/** for p < .10/.05/.01 so the table note no longer renders as a bullet
- Gitignore review-major-points.md; update LOG and README

Co-Authored-By: Claude Opus 5.5 <noreply@anthropic.com>
</commit_message>
<xml_diff>
--- a/_output/supplemental-materials.docx
+++ b/_output/supplemental-materials.docx
@@ -243,7 +243,7 @@
                     <w:jc w:val="center"/>
                   </w:pPr>
                   <w:r>
-                    <w:t xml:space="preserve">0.657***</w:t>
+                    <w:t xml:space="preserve">0.657**</w:t>
                   </w:r>
                 </w:p>
               </w:tc>
@@ -291,7 +291,7 @@
                     <w:jc w:val="center"/>
                   </w:pPr>
                   <w:r>
-                    <w:t xml:space="preserve">-1.224***</w:t>
+                    <w:t xml:space="preserve">-1.224**</w:t>
                   </w:r>
                 </w:p>
               </w:tc>
@@ -387,7 +387,7 @@
                     <w:jc w:val="center"/>
                   </w:pPr>
                   <w:r>
-                    <w:t xml:space="preserve">0.372**</w:t>
+                    <w:t xml:space="preserve">0.372*</w:t>
                   </w:r>
                 </w:p>
               </w:tc>
@@ -435,7 +435,7 @@
                     <w:jc w:val="center"/>
                   </w:pPr>
                   <w:r>
-                    <w:t xml:space="preserve">-0.413*</w:t>
+                    <w:t xml:space="preserve">-0.413†</w:t>
                   </w:r>
                 </w:p>
               </w:tc>
@@ -531,7 +531,7 @@
                     <w:jc w:val="center"/>
                   </w:pPr>
                   <w:r>
-                    <w:t xml:space="preserve">-0.010***</w:t>
+                    <w:t xml:space="preserve">-0.010**</w:t>
                   </w:r>
                 </w:p>
               </w:tc>
@@ -579,7 +579,7 @@
                     <w:jc w:val="center"/>
                   </w:pPr>
                   <w:r>
-                    <w:t xml:space="preserve">0.226***</w:t>
+                    <w:t xml:space="preserve">0.226**</w:t>
                   </w:r>
                 </w:p>
               </w:tc>
@@ -627,7 +627,7 @@
                     <w:jc w:val="center"/>
                   </w:pPr>
                   <w:r>
-                    <w:t xml:space="preserve">0.145*</w:t>
+                    <w:t xml:space="preserve">0.145†</w:t>
                   </w:r>
                 </w:p>
               </w:tc>
@@ -675,7 +675,7 @@
                     <w:jc w:val="center"/>
                   </w:pPr>
                   <w:r>
-                    <w:t xml:space="preserve">0.041**</w:t>
+                    <w:t xml:space="preserve">0.041*</w:t>
                   </w:r>
                 </w:p>
               </w:tc>
@@ -771,7 +771,7 @@
                     <w:jc w:val="center"/>
                   </w:pPr>
                   <w:r>
-                    <w:t xml:space="preserve">5.493***</w:t>
+                    <w:t xml:space="preserve">5.493**</w:t>
                   </w:r>
                 </w:p>
               </w:tc>
@@ -858,14 +858,10 @@
                 <w:p>
                   <w:pPr>
                     <w:pStyle w:val="Compact"/>
-                    <w:numPr>
-                      <w:ilvl w:val="0"/>
-                      <w:numId w:val="1001"/>
-                    </w:numPr>
-                    <w:jc w:val="center"/>
-                  </w:pPr>
-                  <w:r>
-                    <w:t xml:space="preserve">p &lt; 0.1, ** p &lt; 0.05, *** p &lt; 0.01</w:t>
+                    <w:jc w:val="center"/>
+                  </w:pPr>
+                  <w:r>
+                    <w:t xml:space="preserve">† p &lt; 0.1, * p &lt; 0.05, ** p &lt; 0.01</w:t>
                   </w:r>
                 </w:p>
               </w:tc>
@@ -1027,7 +1023,7 @@
         <w:pStyle w:val="Compact"/>
         <w:numPr>
           <w:ilvl w:val="0"/>
-          <w:numId w:val="1002"/>
+          <w:numId w:val="1001"/>
         </w:numPr>
       </w:pPr>
       <w:r>
@@ -1055,7 +1051,7 @@
         <w:pStyle w:val="Compact"/>
         <w:numPr>
           <w:ilvl w:val="0"/>
-          <w:numId w:val="1002"/>
+          <w:numId w:val="1001"/>
         </w:numPr>
       </w:pPr>
       <w:r>
@@ -1083,7 +1079,7 @@
         <w:pStyle w:val="Compact"/>
         <w:numPr>
           <w:ilvl w:val="0"/>
-          <w:numId w:val="1002"/>
+          <w:numId w:val="1001"/>
         </w:numPr>
       </w:pPr>
       <w:r>
@@ -1111,7 +1107,7 @@
         <w:pStyle w:val="Compact"/>
         <w:numPr>
           <w:ilvl w:val="0"/>
-          <w:numId w:val="1002"/>
+          <w:numId w:val="1001"/>
         </w:numPr>
       </w:pPr>
       <w:r>
@@ -1458,7 +1454,7 @@
                     <w:jc w:val="center"/>
                   </w:pPr>
                   <w:r>
-                    <w:t xml:space="preserve">-0.377**</w:t>
+                    <w:t xml:space="preserve">-0.377*</w:t>
                   </w:r>
                 </w:p>
               </w:tc>
@@ -1482,7 +1478,7 @@
                     <w:jc w:val="center"/>
                   </w:pPr>
                   <w:r>
-                    <w:t xml:space="preserve">5.203***</w:t>
+                    <w:t xml:space="preserve">5.203**</w:t>
                   </w:r>
                 </w:p>
               </w:tc>
@@ -1554,7 +1550,7 @@
                     <w:jc w:val="center"/>
                   </w:pPr>
                   <w:r>
-                    <w:t xml:space="preserve">0.743***</w:t>
+                    <w:t xml:space="preserve">0.743**</w:t>
                   </w:r>
                 </w:p>
               </w:tc>
@@ -1578,7 +1574,7 @@
                     <w:jc w:val="center"/>
                   </w:pPr>
                   <w:r>
-                    <w:t xml:space="preserve">-6.790***</w:t>
+                    <w:t xml:space="preserve">-6.790**</w:t>
                   </w:r>
                 </w:p>
               </w:tc>
@@ -2034,7 +2030,7 @@
                     <w:jc w:val="center"/>
                   </w:pPr>
                   <w:r>
-                    <w:t xml:space="preserve">0.007**</w:t>
+                    <w:t xml:space="preserve">0.007*</w:t>
                   </w:r>
                 </w:p>
               </w:tc>
@@ -2058,7 +2054,7 @@
                     <w:jc w:val="center"/>
                   </w:pPr>
                   <w:r>
-                    <w:t xml:space="preserve">-0.101***</w:t>
+                    <w:t xml:space="preserve">-0.101**</w:t>
                   </w:r>
                 </w:p>
               </w:tc>
@@ -2226,7 +2222,7 @@
                     <w:jc w:val="center"/>
                   </w:pPr>
                   <w:r>
-                    <w:t xml:space="preserve">-0.261**</w:t>
+                    <w:t xml:space="preserve">-0.261*</w:t>
                   </w:r>
                 </w:p>
               </w:tc>
@@ -2250,7 +2246,7 @@
                     <w:jc w:val="center"/>
                   </w:pPr>
                   <w:r>
-                    <w:t xml:space="preserve">2.549***</w:t>
+                    <w:t xml:space="preserve">2.549**</w:t>
                   </w:r>
                 </w:p>
               </w:tc>
@@ -2334,19 +2330,19 @@
                     <w:jc w:val="center"/>
                   </w:pPr>
                   <w:r>
-                    <w:t xml:space="preserve">1.166***</w:t>
-                  </w:r>
-                </w:p>
-              </w:tc>
-              <w:tc>
-                <w:tcPr/>
-                <w:p>
-                  <w:pPr>
-                    <w:pStyle w:val="Compact"/>
-                    <w:jc w:val="center"/>
-                  </w:pPr>
-                  <w:r>
-                    <w:t xml:space="preserve">0.410**</w:t>
+                    <w:t xml:space="preserve">1.166**</w:t>
+                  </w:r>
+                </w:p>
+              </w:tc>
+              <w:tc>
+                <w:tcPr/>
+                <w:p>
+                  <w:pPr>
+                    <w:pStyle w:val="Compact"/>
+                    <w:jc w:val="center"/>
+                  </w:pPr>
+                  <w:r>
+                    <w:t xml:space="preserve">0.410*</w:t>
                   </w:r>
                 </w:p>
               </w:tc>
@@ -2418,7 +2414,7 @@
                     <w:jc w:val="center"/>
                   </w:pPr>
                   <w:r>
-                    <w:t xml:space="preserve">-0.031*</w:t>
+                    <w:t xml:space="preserve">-0.031†</w:t>
                   </w:r>
                 </w:p>
               </w:tc>
@@ -2442,7 +2438,7 @@
                     <w:jc w:val="center"/>
                   </w:pPr>
                   <w:r>
-                    <w:t xml:space="preserve">0.496***</w:t>
+                    <w:t xml:space="preserve">0.496**</w:t>
                   </w:r>
                 </w:p>
               </w:tc>
@@ -2526,19 +2522,19 @@
                     <w:jc w:val="center"/>
                   </w:pPr>
                   <w:r>
-                    <w:t xml:space="preserve">12.291***</w:t>
-                  </w:r>
-                </w:p>
-              </w:tc>
-              <w:tc>
-                <w:tcPr/>
-                <w:p>
-                  <w:pPr>
-                    <w:pStyle w:val="Compact"/>
-                    <w:jc w:val="center"/>
-                  </w:pPr>
-                  <w:r>
-                    <w:t xml:space="preserve">18.209***</w:t>
+                    <w:t xml:space="preserve">12.291**</w:t>
+                  </w:r>
+                </w:p>
+              </w:tc>
+              <w:tc>
+                <w:tcPr/>
+                <w:p>
+                  <w:pPr>
+                    <w:pStyle w:val="Compact"/>
+                    <w:jc w:val="center"/>
+                  </w:pPr>
+                  <w:r>
+                    <w:t xml:space="preserve">18.209**</w:t>
                   </w:r>
                 </w:p>
               </w:tc>
@@ -2735,14 +2731,10 @@
                 <w:p>
                   <w:pPr>
                     <w:pStyle w:val="Compact"/>
-                    <w:numPr>
-                      <w:ilvl w:val="0"/>
-                      <w:numId w:val="1003"/>
-                    </w:numPr>
-                    <w:jc w:val="center"/>
-                  </w:pPr>
-                  <w:r>
-                    <w:t xml:space="preserve">p &lt; 0.1, ** p &lt; 0.05, *** p &lt; 0.01</w:t>
+                    <w:jc w:val="center"/>
+                  </w:pPr>
+                  <w:r>
+                    <w:t xml:space="preserve">† p &lt; 0.1, * p &lt; 0.05, ** p &lt; 0.01</w:t>
                   </w:r>
                 </w:p>
               </w:tc>
@@ -3223,7 +3215,7 @@
                     <w:jc w:val="center"/>
                   </w:pPr>
                   <w:r>
-                    <w:t xml:space="preserve">0.647***</w:t>
+                    <w:t xml:space="preserve">0.647**</w:t>
                   </w:r>
                 </w:p>
               </w:tc>
@@ -3271,7 +3263,7 @@
                     <w:jc w:val="center"/>
                   </w:pPr>
                   <w:r>
-                    <w:t xml:space="preserve">-1.221***</w:t>
+                    <w:t xml:space="preserve">-1.221**</w:t>
                   </w:r>
                 </w:p>
               </w:tc>
@@ -3367,7 +3359,7 @@
                     <w:jc w:val="center"/>
                   </w:pPr>
                   <w:r>
-                    <w:t xml:space="preserve">0.354**</w:t>
+                    <w:t xml:space="preserve">0.354*</w:t>
                   </w:r>
                 </w:p>
               </w:tc>
@@ -3415,7 +3407,7 @@
                     <w:jc w:val="center"/>
                   </w:pPr>
                   <w:r>
-                    <w:t xml:space="preserve">-0.412*</w:t>
+                    <w:t xml:space="preserve">-0.412†</w:t>
                   </w:r>
                 </w:p>
               </w:tc>
@@ -3511,7 +3503,7 @@
                     <w:jc w:val="center"/>
                   </w:pPr>
                   <w:r>
-                    <w:t xml:space="preserve">0.041**</w:t>
+                    <w:t xml:space="preserve">0.041*</w:t>
                   </w:r>
                 </w:p>
               </w:tc>
@@ -3559,7 +3551,7 @@
                     <w:jc w:val="center"/>
                   </w:pPr>
                   <w:r>
-                    <w:t xml:space="preserve">-0.011***</w:t>
+                    <w:t xml:space="preserve">-0.011**</w:t>
                   </w:r>
                 </w:p>
               </w:tc>
@@ -3607,7 +3599,7 @@
                     <w:jc w:val="center"/>
                   </w:pPr>
                   <w:r>
-                    <w:t xml:space="preserve">0.239***</w:t>
+                    <w:t xml:space="preserve">0.239**</w:t>
                   </w:r>
                 </w:p>
               </w:tc>
@@ -3655,7 +3647,7 @@
                     <w:jc w:val="center"/>
                   </w:pPr>
                   <w:r>
-                    <w:t xml:space="preserve">0.145*</w:t>
+                    <w:t xml:space="preserve">0.145†</w:t>
                   </w:r>
                 </w:p>
               </w:tc>
@@ -3703,7 +3695,7 @@
                     <w:jc w:val="center"/>
                   </w:pPr>
                   <w:r>
-                    <w:t xml:space="preserve">0.044**</w:t>
+                    <w:t xml:space="preserve">0.044*</w:t>
                   </w:r>
                 </w:p>
               </w:tc>
@@ -3799,7 +3791,7 @@
                     <w:jc w:val="center"/>
                   </w:pPr>
                   <w:r>
-                    <w:t xml:space="preserve">5.194***</w:t>
+                    <w:t xml:space="preserve">5.194**</w:t>
                   </w:r>
                 </w:p>
               </w:tc>
@@ -3886,14 +3878,10 @@
                 <w:p>
                   <w:pPr>
                     <w:pStyle w:val="Compact"/>
-                    <w:numPr>
-                      <w:ilvl w:val="0"/>
-                      <w:numId w:val="1004"/>
-                    </w:numPr>
-                    <w:jc w:val="center"/>
-                  </w:pPr>
-                  <w:r>
-                    <w:t xml:space="preserve">p &lt; 0.1, ** p &lt; 0.05, *** p &lt; 0.01</w:t>
+                    <w:jc w:val="center"/>
+                  </w:pPr>
+                  <w:r>
+                    <w:t xml:space="preserve">† p &lt; 0.1, * p &lt; 0.05, ** p &lt; 0.01</w:t>
                   </w:r>
                 </w:p>
               </w:tc>
@@ -4055,7 +4043,7 @@
         <w:pStyle w:val="Compact"/>
         <w:numPr>
           <w:ilvl w:val="0"/>
-          <w:numId w:val="1005"/>
+          <w:numId w:val="1002"/>
         </w:numPr>
       </w:pPr>
       <w:r>
@@ -4083,7 +4071,7 @@
         <w:pStyle w:val="Compact"/>
         <w:numPr>
           <w:ilvl w:val="0"/>
-          <w:numId w:val="1005"/>
+          <w:numId w:val="1002"/>
         </w:numPr>
       </w:pPr>
       <w:r>
@@ -4111,7 +4099,7 @@
         <w:pStyle w:val="Compact"/>
         <w:numPr>
           <w:ilvl w:val="0"/>
-          <w:numId w:val="1005"/>
+          <w:numId w:val="1002"/>
         </w:numPr>
       </w:pPr>
       <w:r>
@@ -4139,7 +4127,7 @@
         <w:pStyle w:val="Compact"/>
         <w:numPr>
           <w:ilvl w:val="0"/>
-          <w:numId w:val="1005"/>
+          <w:numId w:val="1002"/>
         </w:numPr>
       </w:pPr>
       <w:r>
@@ -4486,7 +4474,7 @@
                     <w:jc w:val="center"/>
                   </w:pPr>
                   <w:r>
-                    <w:t xml:space="preserve">-0.362*</w:t>
+                    <w:t xml:space="preserve">-0.362†</w:t>
                   </w:r>
                 </w:p>
               </w:tc>
@@ -4510,7 +4498,7 @@
                     <w:jc w:val="center"/>
                   </w:pPr>
                   <w:r>
-                    <w:t xml:space="preserve">5.299***</w:t>
+                    <w:t xml:space="preserve">5.299**</w:t>
                   </w:r>
                 </w:p>
               </w:tc>
@@ -4582,7 +4570,7 @@
                     <w:jc w:val="center"/>
                   </w:pPr>
                   <w:r>
-                    <w:t xml:space="preserve">0.742***</w:t>
+                    <w:t xml:space="preserve">0.742**</w:t>
                   </w:r>
                 </w:p>
               </w:tc>
@@ -4606,7 +4594,7 @@
                     <w:jc w:val="center"/>
                   </w:pPr>
                   <w:r>
-                    <w:t xml:space="preserve">-6.818***</w:t>
+                    <w:t xml:space="preserve">-6.818**</w:t>
                   </w:r>
                 </w:p>
               </w:tc>
@@ -4798,7 +4786,7 @@
                     <w:jc w:val="center"/>
                   </w:pPr>
                   <w:r>
-                    <w:t xml:space="preserve">3.660*</w:t>
+                    <w:t xml:space="preserve">3.660†</w:t>
                   </w:r>
                 </w:p>
               </w:tc>
@@ -5062,31 +5050,31 @@
                     <w:jc w:val="center"/>
                   </w:pPr>
                   <w:r>
-                    <w:t xml:space="preserve">-0.067***</w:t>
-                  </w:r>
-                </w:p>
-              </w:tc>
-              <w:tc>
-                <w:tcPr/>
-                <w:p>
-                  <w:pPr>
-                    <w:pStyle w:val="Compact"/>
-                    <w:jc w:val="center"/>
-                  </w:pPr>
-                  <w:r>
-                    <w:t xml:space="preserve">-0.641***</w:t>
-                  </w:r>
-                </w:p>
-              </w:tc>
-              <w:tc>
-                <w:tcPr/>
-                <w:p>
-                  <w:pPr>
-                    <w:pStyle w:val="Compact"/>
-                    <w:jc w:val="center"/>
-                  </w:pPr>
-                  <w:r>
-                    <w:t xml:space="preserve">-0.381**</w:t>
+                    <w:t xml:space="preserve">-0.067**</w:t>
+                  </w:r>
+                </w:p>
+              </w:tc>
+              <w:tc>
+                <w:tcPr/>
+                <w:p>
+                  <w:pPr>
+                    <w:pStyle w:val="Compact"/>
+                    <w:jc w:val="center"/>
+                  </w:pPr>
+                  <w:r>
+                    <w:t xml:space="preserve">-0.641**</w:t>
+                  </w:r>
+                </w:p>
+              </w:tc>
+              <w:tc>
+                <w:tcPr/>
+                <w:p>
+                  <w:pPr>
+                    <w:pStyle w:val="Compact"/>
+                    <w:jc w:val="center"/>
+                  </w:pPr>
+                  <w:r>
+                    <w:t xml:space="preserve">-0.381*</w:t>
                   </w:r>
                 </w:p>
               </w:tc>
@@ -5158,7 +5146,7 @@
                     <w:jc w:val="center"/>
                   </w:pPr>
                   <w:r>
-                    <w:t xml:space="preserve">0.008**</w:t>
+                    <w:t xml:space="preserve">0.008*</w:t>
                   </w:r>
                 </w:p>
               </w:tc>
@@ -5182,7 +5170,7 @@
                     <w:jc w:val="center"/>
                   </w:pPr>
                   <w:r>
-                    <w:t xml:space="preserve">-0.093***</w:t>
+                    <w:t xml:space="preserve">-0.093**</w:t>
                   </w:r>
                 </w:p>
               </w:tc>
@@ -5350,7 +5338,7 @@
                     <w:jc w:val="center"/>
                   </w:pPr>
                   <w:r>
-                    <w:t xml:space="preserve">-0.262**</w:t>
+                    <w:t xml:space="preserve">-0.262*</w:t>
                   </w:r>
                 </w:p>
               </w:tc>
@@ -5374,7 +5362,7 @@
                     <w:jc w:val="center"/>
                   </w:pPr>
                   <w:r>
-                    <w:t xml:space="preserve">2.552***</w:t>
+                    <w:t xml:space="preserve">2.552**</w:t>
                   </w:r>
                 </w:p>
               </w:tc>
@@ -5458,19 +5446,19 @@
                     <w:jc w:val="center"/>
                   </w:pPr>
                   <w:r>
-                    <w:t xml:space="preserve">1.148***</w:t>
-                  </w:r>
-                </w:p>
-              </w:tc>
-              <w:tc>
-                <w:tcPr/>
-                <w:p>
-                  <w:pPr>
-                    <w:pStyle w:val="Compact"/>
-                    <w:jc w:val="center"/>
-                  </w:pPr>
-                  <w:r>
-                    <w:t xml:space="preserve">0.389*</w:t>
+                    <w:t xml:space="preserve">1.148**</w:t>
+                  </w:r>
+                </w:p>
+              </w:tc>
+              <w:tc>
+                <w:tcPr/>
+                <w:p>
+                  <w:pPr>
+                    <w:pStyle w:val="Compact"/>
+                    <w:jc w:val="center"/>
+                  </w:pPr>
+                  <w:r>
+                    <w:t xml:space="preserve">0.389†</w:t>
                   </w:r>
                 </w:p>
               </w:tc>
@@ -5542,7 +5530,7 @@
                     <w:jc w:val="center"/>
                   </w:pPr>
                   <w:r>
-                    <w:t xml:space="preserve">-0.035*</w:t>
+                    <w:t xml:space="preserve">-0.035†</w:t>
                   </w:r>
                 </w:p>
               </w:tc>
@@ -5566,7 +5554,7 @@
                     <w:jc w:val="center"/>
                   </w:pPr>
                   <w:r>
-                    <w:t xml:space="preserve">0.473***</w:t>
+                    <w:t xml:space="preserve">0.473**</w:t>
                   </w:r>
                 </w:p>
               </w:tc>
@@ -5638,31 +5626,31 @@
                     <w:jc w:val="center"/>
                   </w:pPr>
                   <w:r>
-                    <w:t xml:space="preserve">0.593**</w:t>
-                  </w:r>
-                </w:p>
-              </w:tc>
-              <w:tc>
-                <w:tcPr/>
-                <w:p>
-                  <w:pPr>
-                    <w:pStyle w:val="Compact"/>
-                    <w:jc w:val="center"/>
-                  </w:pPr>
-                  <w:r>
-                    <w:t xml:space="preserve">16.788***</w:t>
-                  </w:r>
-                </w:p>
-              </w:tc>
-              <w:tc>
-                <w:tcPr/>
-                <w:p>
-                  <w:pPr>
-                    <w:pStyle w:val="Compact"/>
-                    <w:jc w:val="center"/>
-                  </w:pPr>
-                  <w:r>
-                    <w:t xml:space="preserve">20.989***</w:t>
+                    <w:t xml:space="preserve">0.593*</w:t>
+                  </w:r>
+                </w:p>
+              </w:tc>
+              <w:tc>
+                <w:tcPr/>
+                <w:p>
+                  <w:pPr>
+                    <w:pStyle w:val="Compact"/>
+                    <w:jc w:val="center"/>
+                  </w:pPr>
+                  <w:r>
+                    <w:t xml:space="preserve">16.788**</w:t>
+                  </w:r>
+                </w:p>
+              </w:tc>
+              <w:tc>
+                <w:tcPr/>
+                <w:p>
+                  <w:pPr>
+                    <w:pStyle w:val="Compact"/>
+                    <w:jc w:val="center"/>
+                  </w:pPr>
+                  <w:r>
+                    <w:t xml:space="preserve">20.989**</w:t>
                   </w:r>
                 </w:p>
               </w:tc>
@@ -5859,14 +5847,10 @@
                 <w:p>
                   <w:pPr>
                     <w:pStyle w:val="Compact"/>
-                    <w:numPr>
-                      <w:ilvl w:val="0"/>
-                      <w:numId w:val="1006"/>
-                    </w:numPr>
-                    <w:jc w:val="center"/>
-                  </w:pPr>
-                  <w:r>
-                    <w:t xml:space="preserve">p &lt; 0.1, ** p &lt; 0.05, *** p &lt; 0.01</w:t>
+                    <w:jc w:val="center"/>
+                  </w:pPr>
+                  <w:r>
+                    <w:t xml:space="preserve">† p &lt; 0.1, * p &lt; 0.05, ** p &lt; 0.01</w:t>
                   </w:r>
                 </w:p>
               </w:tc>
@@ -6347,7 +6331,7 @@
                     <w:jc w:val="center"/>
                   </w:pPr>
                   <w:r>
-                    <w:t xml:space="preserve">1.021***</w:t>
+                    <w:t xml:space="preserve">1.021**</w:t>
                   </w:r>
                 </w:p>
               </w:tc>
@@ -6491,7 +6475,7 @@
                     <w:jc w:val="center"/>
                   </w:pPr>
                   <w:r>
-                    <w:t xml:space="preserve">0.351**</w:t>
+                    <w:t xml:space="preserve">0.351*</w:t>
                   </w:r>
                 </w:p>
               </w:tc>
@@ -6539,7 +6523,7 @@
                     <w:jc w:val="center"/>
                   </w:pPr>
                   <w:r>
-                    <w:t xml:space="preserve">-0.398*</w:t>
+                    <w:t xml:space="preserve">-0.398†</w:t>
                   </w:r>
                 </w:p>
               </w:tc>
@@ -6635,7 +6619,7 @@
                     <w:jc w:val="center"/>
                   </w:pPr>
                   <w:r>
-                    <w:t xml:space="preserve">0.134***</w:t>
+                    <w:t xml:space="preserve">0.134**</w:t>
                   </w:r>
                 </w:p>
               </w:tc>
@@ -6827,7 +6811,7 @@
                     <w:jc w:val="center"/>
                   </w:pPr>
                   <w:r>
-                    <w:t xml:space="preserve">-0.133***</w:t>
+                    <w:t xml:space="preserve">-0.133**</w:t>
                   </w:r>
                 </w:p>
               </w:tc>
@@ -6875,7 +6859,7 @@
                     <w:jc w:val="center"/>
                   </w:pPr>
                   <w:r>
-                    <w:t xml:space="preserve">-0.011***</w:t>
+                    <w:t xml:space="preserve">-0.011**</w:t>
                   </w:r>
                 </w:p>
               </w:tc>
@@ -6923,7 +6907,7 @@
                     <w:jc w:val="center"/>
                   </w:pPr>
                   <w:r>
-                    <w:t xml:space="preserve">0.241***</w:t>
+                    <w:t xml:space="preserve">0.241**</w:t>
                   </w:r>
                 </w:p>
               </w:tc>
@@ -6971,7 +6955,7 @@
                     <w:jc w:val="center"/>
                   </w:pPr>
                   <w:r>
-                    <w:t xml:space="preserve">0.151*</w:t>
+                    <w:t xml:space="preserve">0.151†</w:t>
                   </w:r>
                 </w:p>
               </w:tc>
@@ -7019,7 +7003,7 @@
                     <w:jc w:val="center"/>
                   </w:pPr>
                   <w:r>
-                    <w:t xml:space="preserve">0.044**</w:t>
+                    <w:t xml:space="preserve">0.044*</w:t>
                   </w:r>
                 </w:p>
               </w:tc>
@@ -7115,7 +7099,7 @@
                     <w:jc w:val="center"/>
                   </w:pPr>
                   <w:r>
-                    <w:t xml:space="preserve">4.464***</w:t>
+                    <w:t xml:space="preserve">4.464**</w:t>
                   </w:r>
                 </w:p>
               </w:tc>
@@ -7202,14 +7186,10 @@
                 <w:p>
                   <w:pPr>
                     <w:pStyle w:val="Compact"/>
-                    <w:numPr>
-                      <w:ilvl w:val="0"/>
-                      <w:numId w:val="1007"/>
-                    </w:numPr>
-                    <w:jc w:val="center"/>
-                  </w:pPr>
-                  <w:r>
-                    <w:t xml:space="preserve">p &lt; 0.1, ** p &lt; 0.05, *** p &lt; 0.01</w:t>
+                    <w:jc w:val="center"/>
+                  </w:pPr>
+                  <w:r>
+                    <w:t xml:space="preserve">† p &lt; 0.1, * p &lt; 0.05, ** p &lt; 0.01</w:t>
                   </w:r>
                 </w:p>
               </w:tc>
@@ -7222,7 +7202,7 @@
     </w:tbl>
     <w:p>
       <w:pPr>
-        <w:pStyle w:val="FirstParagraph"/>
+        <w:pStyle w:val="BodyText"/>
       </w:pPr>
       <w:r>
         <w:t xml:space="preserve">Concern about energy cost had a significant positive effect on prioritizing fossil fuels over renewables (b = 0.13,</w:t>
@@ -7292,7 +7272,7 @@
         <w:pStyle w:val="Compact"/>
         <w:numPr>
           <w:ilvl w:val="0"/>
-          <w:numId w:val="1008"/>
+          <w:numId w:val="1003"/>
         </w:numPr>
       </w:pPr>
       <w:r>
@@ -7320,7 +7300,7 @@
         <w:pStyle w:val="Compact"/>
         <w:numPr>
           <w:ilvl w:val="0"/>
-          <w:numId w:val="1008"/>
+          <w:numId w:val="1003"/>
         </w:numPr>
       </w:pPr>
       <w:r>
@@ -7487,7 +7467,7 @@
                     <w:jc w:val="center"/>
                   </w:pPr>
                   <w:r>
-                    <w:t xml:space="preserve">-11.261**</w:t>
+                    <w:t xml:space="preserve">-11.261*</w:t>
                   </w:r>
                 </w:p>
               </w:tc>
@@ -7667,7 +7647,7 @@
                     <w:jc w:val="center"/>
                   </w:pPr>
                   <w:r>
-                    <w:t xml:space="preserve">-1.328***</w:t>
+                    <w:t xml:space="preserve">-1.328**</w:t>
                   </w:r>
                 </w:p>
               </w:tc>
@@ -8243,19 +8223,19 @@
                     <w:jc w:val="center"/>
                   </w:pPr>
                   <w:r>
-                    <w:t xml:space="preserve">-0.149***</w:t>
-                  </w:r>
-                </w:p>
-              </w:tc>
-              <w:tc>
-                <w:tcPr/>
-                <w:p>
-                  <w:pPr>
-                    <w:pStyle w:val="Compact"/>
-                    <w:jc w:val="center"/>
-                  </w:pPr>
-                  <w:r>
-                    <w:t xml:space="preserve">-1.294***</w:t>
+                    <w:t xml:space="preserve">-0.149**</w:t>
+                  </w:r>
+                </w:p>
+              </w:tc>
+              <w:tc>
+                <w:tcPr/>
+                <w:p>
+                  <w:pPr>
+                    <w:pStyle w:val="Compact"/>
+                    <w:jc w:val="center"/>
+                  </w:pPr>
+                  <w:r>
+                    <w:t xml:space="preserve">-1.294**</w:t>
                   </w:r>
                 </w:p>
               </w:tc>
@@ -8351,7 +8331,7 @@
                     <w:jc w:val="center"/>
                   </w:pPr>
                   <w:r>
-                    <w:t xml:space="preserve">1.074**</w:t>
+                    <w:t xml:space="preserve">1.074*</w:t>
                   </w:r>
                 </w:p>
               </w:tc>
@@ -8531,7 +8511,7 @@
                     <w:jc w:val="center"/>
                   </w:pPr>
                   <w:r>
-                    <w:t xml:space="preserve">0.124**</w:t>
+                    <w:t xml:space="preserve">0.124*</w:t>
                   </w:r>
                 </w:p>
               </w:tc>
@@ -8627,7 +8607,7 @@
                     <w:jc w:val="center"/>
                   </w:pPr>
                   <w:r>
-                    <w:t xml:space="preserve">0.119**</w:t>
+                    <w:t xml:space="preserve">0.119*</w:t>
                   </w:r>
                 </w:p>
               </w:tc>
@@ -8723,7 +8703,7 @@
                     <w:jc w:val="center"/>
                   </w:pPr>
                   <w:r>
-                    <w:t xml:space="preserve">0.008**</w:t>
+                    <w:t xml:space="preserve">0.008*</w:t>
                   </w:r>
                 </w:p>
               </w:tc>
@@ -8747,7 +8727,7 @@
                     <w:jc w:val="center"/>
                   </w:pPr>
                   <w:r>
-                    <w:t xml:space="preserve">-0.092***</w:t>
+                    <w:t xml:space="preserve">-0.092**</w:t>
                   </w:r>
                 </w:p>
               </w:tc>
@@ -8915,7 +8895,7 @@
                     <w:jc w:val="center"/>
                   </w:pPr>
                   <w:r>
-                    <w:t xml:space="preserve">-0.260**</w:t>
+                    <w:t xml:space="preserve">-0.260*</w:t>
                   </w:r>
                 </w:p>
               </w:tc>
@@ -8939,7 +8919,7 @@
                     <w:jc w:val="center"/>
                   </w:pPr>
                   <w:r>
-                    <w:t xml:space="preserve">2.541***</w:t>
+                    <w:t xml:space="preserve">2.541**</w:t>
                   </w:r>
                 </w:p>
               </w:tc>
@@ -9023,19 +9003,19 @@
                     <w:jc w:val="center"/>
                   </w:pPr>
                   <w:r>
-                    <w:t xml:space="preserve">1.150***</w:t>
-                  </w:r>
-                </w:p>
-              </w:tc>
-              <w:tc>
-                <w:tcPr/>
-                <w:p>
-                  <w:pPr>
-                    <w:pStyle w:val="Compact"/>
-                    <w:jc w:val="center"/>
-                  </w:pPr>
-                  <w:r>
-                    <w:t xml:space="preserve">0.387*</w:t>
+                    <w:t xml:space="preserve">1.150**</w:t>
+                  </w:r>
+                </w:p>
+              </w:tc>
+              <w:tc>
+                <w:tcPr/>
+                <w:p>
+                  <w:pPr>
+                    <w:pStyle w:val="Compact"/>
+                    <w:jc w:val="center"/>
+                  </w:pPr>
+                  <w:r>
+                    <w:t xml:space="preserve">0.387†</w:t>
                   </w:r>
                 </w:p>
               </w:tc>
@@ -9107,7 +9087,7 @@
                     <w:jc w:val="center"/>
                   </w:pPr>
                   <w:r>
-                    <w:t xml:space="preserve">-0.033*</w:t>
+                    <w:t xml:space="preserve">-0.033†</w:t>
                   </w:r>
                 </w:p>
               </w:tc>
@@ -9131,7 +9111,7 @@
                     <w:jc w:val="center"/>
                   </w:pPr>
                   <w:r>
-                    <w:t xml:space="preserve">0.478***</w:t>
+                    <w:t xml:space="preserve">0.478**</w:t>
                   </w:r>
                 </w:p>
               </w:tc>
@@ -9203,31 +9183,31 @@
                     <w:jc w:val="center"/>
                   </w:pPr>
                   <w:r>
-                    <w:t xml:space="preserve">1.235***</w:t>
-                  </w:r>
-                </w:p>
-              </w:tc>
-              <w:tc>
-                <w:tcPr/>
-                <w:p>
-                  <w:pPr>
-                    <w:pStyle w:val="Compact"/>
-                    <w:jc w:val="center"/>
-                  </w:pPr>
-                  <w:r>
-                    <w:t xml:space="preserve">21.574***</w:t>
-                  </w:r>
-                </w:p>
-              </w:tc>
-              <w:tc>
-                <w:tcPr/>
-                <w:p>
-                  <w:pPr>
-                    <w:pStyle w:val="Compact"/>
-                    <w:jc w:val="center"/>
-                  </w:pPr>
-                  <w:r>
-                    <w:t xml:space="preserve">21.209***</w:t>
+                    <w:t xml:space="preserve">1.235**</w:t>
+                  </w:r>
+                </w:p>
+              </w:tc>
+              <w:tc>
+                <w:tcPr/>
+                <w:p>
+                  <w:pPr>
+                    <w:pStyle w:val="Compact"/>
+                    <w:jc w:val="center"/>
+                  </w:pPr>
+                  <w:r>
+                    <w:t xml:space="preserve">21.574**</w:t>
+                  </w:r>
+                </w:p>
+              </w:tc>
+              <w:tc>
+                <w:tcPr/>
+                <w:p>
+                  <w:pPr>
+                    <w:pStyle w:val="Compact"/>
+                    <w:jc w:val="center"/>
+                  </w:pPr>
+                  <w:r>
+                    <w:t xml:space="preserve">21.209**</w:t>
                   </w:r>
                 </w:p>
               </w:tc>
@@ -9424,14 +9404,10 @@
                 <w:p>
                   <w:pPr>
                     <w:pStyle w:val="Compact"/>
-                    <w:numPr>
-                      <w:ilvl w:val="0"/>
-                      <w:numId w:val="1009"/>
-                    </w:numPr>
-                    <w:jc w:val="center"/>
-                  </w:pPr>
-                  <w:r>
-                    <w:t xml:space="preserve">p &lt; 0.1, ** p &lt; 0.05, *** p &lt; 0.01</w:t>
+                    <w:jc w:val="center"/>
+                  </w:pPr>
+                  <w:r>
+                    <w:t xml:space="preserve">† p &lt; 0.1, * p &lt; 0.05, ** p &lt; 0.01</w:t>
                   </w:r>
                 </w:p>
               </w:tc>
@@ -9444,7 +9420,7 @@
     </w:tbl>
     <w:p>
       <w:pPr>
-        <w:pStyle w:val="FirstParagraph"/>
+        <w:pStyle w:val="BodyText"/>
       </w:pPr>
       <w:r>
         <w:t xml:space="preserve">For fossil fuels, concern about energy cost lowered the odds of any positive WTP (b = -0.15, log-odds scale,</w:t>
@@ -9574,7 +9550,7 @@
         <w:pStyle w:val="Compact"/>
         <w:numPr>
           <w:ilvl w:val="0"/>
-          <w:numId w:val="1010"/>
+          <w:numId w:val="1004"/>
         </w:numPr>
       </w:pPr>
       <w:r>
@@ -9602,7 +9578,7 @@
         <w:pStyle w:val="Compact"/>
         <w:numPr>
           <w:ilvl w:val="0"/>
-          <w:numId w:val="1010"/>
+          <w:numId w:val="1004"/>
         </w:numPr>
       </w:pPr>
       <w:r>
@@ -9630,7 +9606,7 @@
         <w:pStyle w:val="Compact"/>
         <w:numPr>
           <w:ilvl w:val="0"/>
-          <w:numId w:val="1010"/>
+          <w:numId w:val="1004"/>
         </w:numPr>
       </w:pPr>
       <w:r>
@@ -9670,7 +9646,7 @@
         <w:pStyle w:val="Compact"/>
         <w:numPr>
           <w:ilvl w:val="0"/>
-          <w:numId w:val="1011"/>
+          <w:numId w:val="1005"/>
         </w:numPr>
       </w:pPr>
       <w:r>
@@ -9698,7 +9674,7 @@
         <w:pStyle w:val="Compact"/>
         <w:numPr>
           <w:ilvl w:val="0"/>
-          <w:numId w:val="1011"/>
+          <w:numId w:val="1005"/>
         </w:numPr>
       </w:pPr>
       <w:r>
@@ -9738,7 +9714,7 @@
         <w:pStyle w:val="Compact"/>
         <w:numPr>
           <w:ilvl w:val="0"/>
-          <w:numId w:val="1012"/>
+          <w:numId w:val="1006"/>
         </w:numPr>
       </w:pPr>
       <w:r>
@@ -10085,24 +10061,6 @@
     <w:abstractNumId w:val="991"/>
   </w:num>
   <w:num w:numId="1006">
-    <w:abstractNumId w:val="991"/>
-  </w:num>
-  <w:num w:numId="1007">
-    <w:abstractNumId w:val="991"/>
-  </w:num>
-  <w:num w:numId="1008">
-    <w:abstractNumId w:val="991"/>
-  </w:num>
-  <w:num w:numId="1009">
-    <w:abstractNumId w:val="991"/>
-  </w:num>
-  <w:num w:numId="1010">
-    <w:abstractNumId w:val="991"/>
-  </w:num>
-  <w:num w:numId="1011">
-    <w:abstractNumId w:val="991"/>
-  </w:num>
-  <w:num w:numId="1012">
     <w:abstractNumId w:val="991"/>
   </w:num>
 </w:numbering>

</xml_diff>